<commit_message>
TECOM - codigo ubalde practica 2
</commit_message>
<xml_diff>
--- a/curso2/TECOM/practica2/Memoria_practica2.docx
+++ b/curso2/TECOM/practica2/Memoria_practica2.docx
@@ -1097,13 +1097,7 @@
         <w:t>COMENTARIO_LINEA</w:t>
       </w:r>
       <w:r>
-        <w:t>_NO_ACTUALIZADO</w:t>
-      </w:r>
-      <w:r>
-        <w:t>: Se utiliza para definir cuando el código de entrada se encuentra en un comentario de tipo línea</w:t>
-      </w:r>
-      <w:r>
-        <w:t xml:space="preserve"> y no esta actualizado, es decir ha encontrado ups</w:t>
+        <w:t>_NO_ACTUALIZADO: Se utiliza para definir cuando el código de entrada se encuentra en un comentario de tipo línea y no esta actualizado, es decir ha encontrado ups</w:t>
       </w:r>
     </w:p>
     <w:p>
@@ -1236,19 +1230,13 @@
         <w:t>COMENTARIO_LINEA</w:t>
       </w:r>
       <w:r>
-        <w:t>_NO_ACTUALIZADO</w:t>
-      </w:r>
-      <w:r>
-        <w:t xml:space="preserve"> o </w:t>
+        <w:t xml:space="preserve">_NO_ACTUALIZADO o </w:t>
       </w:r>
       <w:r>
         <w:t>COMENTARIO_MULTI_LINEA</w:t>
       </w:r>
       <w:r>
-        <w:t>_NO_ACTUALIZADO</w:t>
-      </w:r>
-      <w:r>
-        <w:t xml:space="preserve"> dependiendo el caso</w:t>
+        <w:t>_NO_ACTUALIZADO dependiendo el caso</w:t>
       </w:r>
     </w:p>
     <w:p>
@@ -1325,10 +1313,7 @@
         <w:t>.</w:t>
       </w:r>
       <w:r>
-        <w:t xml:space="preserve"> Pero e</w:t>
-      </w:r>
-      <w:r>
-        <w:t xml:space="preserve">n el caso de se encuentre un salto de linea en el caso del </w:t>
+        <w:t xml:space="preserve"> Pero en el caso de se encuentre un salto de linea en el caso del </w:t>
       </w:r>
       <w:r>
         <w:t>COMENTARIO_LINEA</w:t>
@@ -1340,10 +1325,7 @@
         <w:t>COMENTARIO_MULTI_LINEA</w:t>
       </w:r>
       <w:r>
-        <w:t>_NO_ACTUALIZADO</w:t>
-      </w:r>
-      <w:r>
-        <w:t xml:space="preserve">, </w:t>
+        <w:t xml:space="preserve">_NO_ACTUALIZADO, </w:t>
       </w:r>
       <w:r>
         <w:t>se imprime por pantalla el texto NO_ACTUALIZADO y vuelve a la condición de arranque INITAL.</w:t>
@@ -5638,7 +5620,7 @@
                 <w:sz w:val="16"/>
                 <w:szCs w:val="16"/>
               </w:rPr>
-              <w:t>if (ups( p2, p1)&amp;&amp;ups( t2+t3, t1)) {</w:t>
+              <w:t>if (ups( p2,p1)&amp;&amp;ups( t2+t3,t1)) {</w:t>
             </w:r>
           </w:p>
           <w:p>
@@ -5723,7 +5705,7 @@
                 <w:sz w:val="16"/>
                 <w:szCs w:val="16"/>
               </w:rPr>
-              <w:t xml:space="preserve">   a2, a1);</w:t>
+              <w:t xml:space="preserve">   a2,a1);</w:t>
             </w:r>
           </w:p>
           <w:p>
@@ -5757,7 +5739,7 @@
                 <w:sz w:val="16"/>
                 <w:szCs w:val="16"/>
               </w:rPr>
-              <w:t>ups(a1,  a2, ups1, ups2);</w:t>
+              <w:t>ups(a1, a2, ups1, ups2);</w:t>
             </w:r>
           </w:p>
           <w:p>
@@ -6240,6 +6222,655 @@
                 <w:szCs w:val="16"/>
               </w:rPr>
               <w:lastRenderedPageBreak/>
+              <w:t>ups( b,a);</w:t>
+            </w:r>
+          </w:p>
+          <w:p>
+            <w:pPr>
+              <w:pStyle w:val="Sinespaciado"/>
+              <w:contextualSpacing/>
+              <w:rPr>
+                <w:sz w:val="16"/>
+                <w:szCs w:val="16"/>
+              </w:rPr>
+            </w:pPr>
+            <w:r>
+              <w:rPr>
+                <w:sz w:val="16"/>
+                <w:szCs w:val="16"/>
+              </w:rPr>
+              <w:t>ups( y2,x1);</w:t>
+            </w:r>
+          </w:p>
+          <w:p>
+            <w:pPr>
+              <w:pStyle w:val="Sinespaciado"/>
+              <w:contextualSpacing/>
+              <w:rPr>
+                <w:sz w:val="16"/>
+                <w:szCs w:val="16"/>
+              </w:rPr>
+            </w:pPr>
+            <w:r>
+              <w:rPr>
+                <w:sz w:val="16"/>
+                <w:szCs w:val="16"/>
+              </w:rPr>
+              <w:t>ups( param2,param1);</w:t>
+            </w:r>
+          </w:p>
+          <w:p>
+            <w:pPr>
+              <w:pStyle w:val="Sinespaciado"/>
+              <w:contextualSpacing/>
+              <w:rPr>
+                <w:sz w:val="16"/>
+                <w:szCs w:val="16"/>
+              </w:rPr>
+            </w:pPr>
+          </w:p>
+          <w:p>
+            <w:pPr>
+              <w:pStyle w:val="Sinespaciado"/>
+              <w:contextualSpacing/>
+              <w:rPr>
+                <w:sz w:val="16"/>
+                <w:szCs w:val="16"/>
+              </w:rPr>
+            </w:pPr>
+            <w:r>
+              <w:rPr>
+                <w:sz w:val="16"/>
+                <w:szCs w:val="16"/>
+              </w:rPr>
+              <w:t>// Tres parámetros (NO intercambiar)</w:t>
+            </w:r>
+          </w:p>
+          <w:p>
+            <w:pPr>
+              <w:pStyle w:val="Sinespaciado"/>
+              <w:contextualSpacing/>
+              <w:rPr>
+                <w:sz w:val="16"/>
+                <w:szCs w:val="16"/>
+              </w:rPr>
+            </w:pPr>
+            <w:r>
+              <w:rPr>
+                <w:sz w:val="16"/>
+                <w:szCs w:val="16"/>
+              </w:rPr>
+              <w:t>ups(a, b, c);</w:t>
+            </w:r>
+          </w:p>
+          <w:p>
+            <w:pPr>
+              <w:pStyle w:val="Sinespaciado"/>
+              <w:contextualSpacing/>
+              <w:rPr>
+                <w:sz w:val="16"/>
+                <w:szCs w:val="16"/>
+              </w:rPr>
+            </w:pPr>
+            <w:r>
+              <w:rPr>
+                <w:sz w:val="16"/>
+                <w:szCs w:val="16"/>
+              </w:rPr>
+              <w:t>ups(x, y, z);</w:t>
+            </w:r>
+          </w:p>
+          <w:p>
+            <w:pPr>
+              <w:pStyle w:val="Sinespaciado"/>
+              <w:contextualSpacing/>
+              <w:rPr>
+                <w:sz w:val="16"/>
+                <w:szCs w:val="16"/>
+              </w:rPr>
+            </w:pPr>
+          </w:p>
+          <w:p>
+            <w:pPr>
+              <w:pStyle w:val="Sinespaciado"/>
+              <w:contextualSpacing/>
+              <w:rPr>
+                <w:sz w:val="16"/>
+                <w:szCs w:val="16"/>
+              </w:rPr>
+            </w:pPr>
+            <w:r>
+              <w:rPr>
+                <w:sz w:val="16"/>
+                <w:szCs w:val="16"/>
+              </w:rPr>
+              <w:t>// Cuatro o más parámetros (NO intercambiar)</w:t>
+            </w:r>
+          </w:p>
+          <w:p>
+            <w:pPr>
+              <w:pStyle w:val="Sinespaciado"/>
+              <w:contextualSpacing/>
+              <w:rPr>
+                <w:sz w:val="16"/>
+                <w:szCs w:val="16"/>
+              </w:rPr>
+            </w:pPr>
+            <w:r>
+              <w:rPr>
+                <w:sz w:val="16"/>
+                <w:szCs w:val="16"/>
+              </w:rPr>
+              <w:t>ups(a, b, c, d);</w:t>
+            </w:r>
+          </w:p>
+          <w:p>
+            <w:pPr>
+              <w:pStyle w:val="Sinespaciado"/>
+              <w:contextualSpacing/>
+              <w:rPr>
+                <w:sz w:val="16"/>
+                <w:szCs w:val="16"/>
+              </w:rPr>
+            </w:pPr>
+            <w:r>
+              <w:rPr>
+                <w:sz w:val="16"/>
+                <w:szCs w:val="16"/>
+              </w:rPr>
+              <w:t>ups(p1, p2, p3, p4, p5);</w:t>
+            </w:r>
+          </w:p>
+          <w:p>
+            <w:pPr>
+              <w:pStyle w:val="Sinespaciado"/>
+              <w:contextualSpacing/>
+              <w:rPr>
+                <w:sz w:val="16"/>
+                <w:szCs w:val="16"/>
+              </w:rPr>
+            </w:pPr>
+          </w:p>
+          <w:p>
+            <w:pPr>
+              <w:pStyle w:val="Sinespaciado"/>
+              <w:contextualSpacing/>
+              <w:rPr>
+                <w:sz w:val="16"/>
+                <w:szCs w:val="16"/>
+              </w:rPr>
+            </w:pPr>
+          </w:p>
+          <w:p>
+            <w:pPr>
+              <w:pStyle w:val="Sinespaciado"/>
+              <w:contextualSpacing/>
+              <w:rPr>
+                <w:sz w:val="16"/>
+                <w:szCs w:val="16"/>
+              </w:rPr>
+            </w:pPr>
+          </w:p>
+          <w:p>
+            <w:pPr>
+              <w:pStyle w:val="Sinespaciado"/>
+              <w:contextualSpacing/>
+              <w:rPr>
+                <w:sz w:val="16"/>
+                <w:szCs w:val="16"/>
+              </w:rPr>
+            </w:pPr>
+          </w:p>
+          <w:p>
+            <w:pPr>
+              <w:pStyle w:val="Sinespaciado"/>
+              <w:contextualSpacing/>
+              <w:rPr>
+                <w:sz w:val="16"/>
+                <w:szCs w:val="16"/>
+              </w:rPr>
+            </w:pPr>
+            <w:r>
+              <w:rPr>
+                <w:sz w:val="16"/>
+                <w:szCs w:val="16"/>
+              </w:rPr>
+              <w:t>/* ========================================</w:t>
+            </w:r>
+          </w:p>
+          <w:p>
+            <w:pPr>
+              <w:pStyle w:val="Sinespaciado"/>
+              <w:contextualSpacing/>
+              <w:rPr>
+                <w:sz w:val="16"/>
+                <w:szCs w:val="16"/>
+              </w:rPr>
+            </w:pPr>
+            <w:r>
+              <w:rPr>
+                <w:sz w:val="16"/>
+                <w:szCs w:val="16"/>
+              </w:rPr>
+              <w:t xml:space="preserve">   CASO 4: ups con espacios variados</w:t>
+            </w:r>
+          </w:p>
+          <w:p>
+            <w:pPr>
+              <w:pStyle w:val="Sinespaciado"/>
+              <w:contextualSpacing/>
+              <w:rPr>
+                <w:sz w:val="16"/>
+                <w:szCs w:val="16"/>
+              </w:rPr>
+            </w:pPr>
+            <w:r>
+              <w:rPr>
+                <w:sz w:val="16"/>
+                <w:szCs w:val="16"/>
+              </w:rPr>
+              <w:t xml:space="preserve">   ======================================== NO ACTUALIZADO*/</w:t>
+            </w:r>
+          </w:p>
+          <w:p>
+            <w:pPr>
+              <w:pStyle w:val="Sinespaciado"/>
+              <w:contextualSpacing/>
+              <w:rPr>
+                <w:sz w:val="16"/>
+                <w:szCs w:val="16"/>
+              </w:rPr>
+            </w:pPr>
+            <w:r>
+              <w:rPr>
+                <w:sz w:val="16"/>
+                <w:szCs w:val="16"/>
+              </w:rPr>
+              <w:t>ups ( b,a);</w:t>
+            </w:r>
+          </w:p>
+          <w:p>
+            <w:pPr>
+              <w:pStyle w:val="Sinespaciado"/>
+              <w:contextualSpacing/>
+              <w:rPr>
+                <w:sz w:val="16"/>
+                <w:szCs w:val="16"/>
+              </w:rPr>
+            </w:pPr>
+            <w:r>
+              <w:rPr>
+                <w:sz w:val="16"/>
+                <w:szCs w:val="16"/>
+              </w:rPr>
+              <w:t>ups  ( y,x);</w:t>
+            </w:r>
+          </w:p>
+          <w:p>
+            <w:pPr>
+              <w:pStyle w:val="Sinespaciado"/>
+              <w:contextualSpacing/>
+              <w:rPr>
+                <w:sz w:val="16"/>
+                <w:szCs w:val="16"/>
+              </w:rPr>
+            </w:pPr>
+            <w:r>
+              <w:rPr>
+                <w:sz w:val="16"/>
+                <w:szCs w:val="16"/>
+              </w:rPr>
+              <w:t>ups</w:t>
+            </w:r>
+            <w:r>
+              <w:rPr>
+                <w:sz w:val="16"/>
+                <w:szCs w:val="16"/>
+              </w:rPr>
+              <w:tab/>
+              <w:t>( n,m);</w:t>
+            </w:r>
+          </w:p>
+          <w:p>
+            <w:pPr>
+              <w:pStyle w:val="Sinespaciado"/>
+              <w:contextualSpacing/>
+              <w:rPr>
+                <w:sz w:val="16"/>
+                <w:szCs w:val="16"/>
+              </w:rPr>
+            </w:pPr>
+            <w:r>
+              <w:rPr>
+                <w:sz w:val="16"/>
+                <w:szCs w:val="16"/>
+              </w:rPr>
+              <w:t>ups      ( q,p);</w:t>
+            </w:r>
+          </w:p>
+          <w:p>
+            <w:pPr>
+              <w:pStyle w:val="Sinespaciado"/>
+              <w:contextualSpacing/>
+              <w:rPr>
+                <w:sz w:val="16"/>
+                <w:szCs w:val="16"/>
+              </w:rPr>
+            </w:pPr>
+            <w:r>
+              <w:rPr>
+                <w:sz w:val="16"/>
+                <w:szCs w:val="16"/>
+              </w:rPr>
+              <w:t>ups                                          ( t,s);</w:t>
+            </w:r>
+          </w:p>
+          <w:p>
+            <w:pPr>
+              <w:pStyle w:val="Sinespaciado"/>
+              <w:contextualSpacing/>
+              <w:rPr>
+                <w:sz w:val="16"/>
+                <w:szCs w:val="16"/>
+              </w:rPr>
+            </w:pPr>
+          </w:p>
+          <w:p>
+            <w:pPr>
+              <w:pStyle w:val="Sinespaciado"/>
+              <w:contextualSpacing/>
+              <w:rPr>
+                <w:sz w:val="16"/>
+                <w:szCs w:val="16"/>
+              </w:rPr>
+            </w:pPr>
+            <w:r>
+              <w:rPr>
+                <w:sz w:val="16"/>
+                <w:szCs w:val="16"/>
+              </w:rPr>
+              <w:t>/* ========================================</w:t>
+            </w:r>
+          </w:p>
+          <w:p>
+            <w:pPr>
+              <w:pStyle w:val="Sinespaciado"/>
+              <w:contextualSpacing/>
+              <w:rPr>
+                <w:sz w:val="16"/>
+                <w:szCs w:val="16"/>
+              </w:rPr>
+            </w:pPr>
+            <w:r>
+              <w:rPr>
+                <w:sz w:val="16"/>
+                <w:szCs w:val="16"/>
+              </w:rPr>
+              <w:t xml:space="preserve">   CASO 5: Parámetros con expresiones</w:t>
+            </w:r>
+          </w:p>
+          <w:p>
+            <w:pPr>
+              <w:pStyle w:val="Sinespaciado"/>
+              <w:contextualSpacing/>
+              <w:rPr>
+                <w:sz w:val="16"/>
+                <w:szCs w:val="16"/>
+              </w:rPr>
+            </w:pPr>
+            <w:r>
+              <w:rPr>
+                <w:sz w:val="16"/>
+                <w:szCs w:val="16"/>
+              </w:rPr>
+              <w:t xml:space="preserve">   ======================================== */</w:t>
+            </w:r>
+          </w:p>
+          <w:p>
+            <w:pPr>
+              <w:pStyle w:val="Sinespaciado"/>
+              <w:contextualSpacing/>
+              <w:rPr>
+                <w:sz w:val="16"/>
+                <w:szCs w:val="16"/>
+              </w:rPr>
+            </w:pPr>
+            <w:r>
+              <w:rPr>
+                <w:sz w:val="16"/>
+                <w:szCs w:val="16"/>
+              </w:rPr>
+              <w:t>ups( c-d,a+b);</w:t>
+            </w:r>
+          </w:p>
+          <w:p>
+            <w:pPr>
+              <w:pStyle w:val="Sinespaciado"/>
+              <w:contextualSpacing/>
+              <w:rPr>
+                <w:sz w:val="16"/>
+                <w:szCs w:val="16"/>
+              </w:rPr>
+            </w:pPr>
+            <w:r>
+              <w:rPr>
+                <w:sz w:val="16"/>
+                <w:szCs w:val="16"/>
+              </w:rPr>
+              <w:t>ups( y/3,x*2);</w:t>
+            </w:r>
+          </w:p>
+          <w:p>
+            <w:pPr>
+              <w:pStyle w:val="Sinespaciado"/>
+              <w:contextualSpacing/>
+              <w:rPr>
+                <w:sz w:val="16"/>
+                <w:szCs w:val="16"/>
+              </w:rPr>
+            </w:pPr>
+            <w:r>
+              <w:rPr>
+                <w:sz w:val="16"/>
+                <w:szCs w:val="16"/>
+              </w:rPr>
+              <w:t>ups( arr[1],arr[0]);</w:t>
+            </w:r>
+          </w:p>
+          <w:p>
+            <w:pPr>
+              <w:pStyle w:val="Sinespaciado"/>
+              <w:contextualSpacing/>
+              <w:rPr>
+                <w:sz w:val="16"/>
+                <w:szCs w:val="16"/>
+              </w:rPr>
+            </w:pPr>
+            <w:r>
+              <w:rPr>
+                <w:sz w:val="16"/>
+                <w:szCs w:val="16"/>
+              </w:rPr>
+              <w:t>ups(func(), var);</w:t>
+            </w:r>
+          </w:p>
+          <w:p>
+            <w:pPr>
+              <w:pStyle w:val="Sinespaciado"/>
+              <w:contextualSpacing/>
+              <w:rPr>
+                <w:sz w:val="16"/>
+                <w:szCs w:val="16"/>
+              </w:rPr>
+            </w:pPr>
+            <w:r>
+              <w:rPr>
+                <w:sz w:val="16"/>
+                <w:szCs w:val="16"/>
+              </w:rPr>
+              <w:t>ups( --b,a++);</w:t>
+            </w:r>
+          </w:p>
+          <w:p>
+            <w:pPr>
+              <w:pStyle w:val="Sinespaciado"/>
+              <w:contextualSpacing/>
+              <w:rPr>
+                <w:sz w:val="16"/>
+                <w:szCs w:val="16"/>
+              </w:rPr>
+            </w:pPr>
+            <w:r>
+              <w:rPr>
+                <w:sz w:val="16"/>
+                <w:szCs w:val="16"/>
+              </w:rPr>
+              <w:t>ups( y&lt;10,x&gt;0);</w:t>
+            </w:r>
+          </w:p>
+          <w:p>
+            <w:pPr>
+              <w:pStyle w:val="Sinespaciado"/>
+              <w:contextualSpacing/>
+              <w:rPr>
+                <w:sz w:val="16"/>
+                <w:szCs w:val="16"/>
+              </w:rPr>
+            </w:pPr>
+            <w:r>
+              <w:rPr>
+                <w:sz w:val="16"/>
+                <w:szCs w:val="16"/>
+              </w:rPr>
+              <w:t>ups(x&gt;0, y&lt;10,a);</w:t>
+            </w:r>
+          </w:p>
+          <w:p>
+            <w:pPr>
+              <w:pStyle w:val="Sinespaciado"/>
+              <w:contextualSpacing/>
+              <w:rPr>
+                <w:sz w:val="16"/>
+                <w:szCs w:val="16"/>
+              </w:rPr>
+            </w:pPr>
+            <w:r>
+              <w:rPr>
+                <w:sz w:val="16"/>
+                <w:szCs w:val="16"/>
+              </w:rPr>
+              <w:t>ups( y&lt;10,x&gt;0;asdfaf);</w:t>
+            </w:r>
+          </w:p>
+          <w:p>
+            <w:pPr>
+              <w:pStyle w:val="Sinespaciado"/>
+              <w:contextualSpacing/>
+              <w:rPr>
+                <w:sz w:val="16"/>
+                <w:szCs w:val="16"/>
+              </w:rPr>
+            </w:pPr>
+          </w:p>
+          <w:p>
+            <w:pPr>
+              <w:pStyle w:val="Sinespaciado"/>
+              <w:contextualSpacing/>
+              <w:rPr>
+                <w:sz w:val="16"/>
+                <w:szCs w:val="16"/>
+              </w:rPr>
+            </w:pPr>
+            <w:r>
+              <w:rPr>
+                <w:sz w:val="16"/>
+                <w:szCs w:val="16"/>
+              </w:rPr>
+              <w:t>/* ========================================</w:t>
+            </w:r>
+          </w:p>
+          <w:p>
+            <w:pPr>
+              <w:pStyle w:val="Sinespaciado"/>
+              <w:contextualSpacing/>
+              <w:rPr>
+                <w:sz w:val="16"/>
+                <w:szCs w:val="16"/>
+              </w:rPr>
+            </w:pPr>
+            <w:r>
+              <w:rPr>
+                <w:sz w:val="16"/>
+                <w:szCs w:val="16"/>
+              </w:rPr>
+              <w:t xml:space="preserve">   CASO 6: Parámetros con espacios y saltos</w:t>
+            </w:r>
+          </w:p>
+          <w:p>
+            <w:pPr>
+              <w:pStyle w:val="Sinespaciado"/>
+              <w:contextualSpacing/>
+              <w:rPr>
+                <w:sz w:val="16"/>
+                <w:szCs w:val="16"/>
+              </w:rPr>
+            </w:pPr>
+            <w:r>
+              <w:rPr>
+                <w:sz w:val="16"/>
+                <w:szCs w:val="16"/>
+              </w:rPr>
+              <w:t xml:space="preserve">   ======================================== */</w:t>
+            </w:r>
+          </w:p>
+          <w:p>
+            <w:pPr>
+              <w:pStyle w:val="Sinespaciado"/>
+              <w:contextualSpacing/>
+              <w:rPr>
+                <w:sz w:val="16"/>
+                <w:szCs w:val="16"/>
+              </w:rPr>
+            </w:pPr>
+            <w:r>
+              <w:rPr>
+                <w:sz w:val="16"/>
+                <w:szCs w:val="16"/>
+              </w:rPr>
+              <w:t>ups(b,a );</w:t>
+            </w:r>
+          </w:p>
+          <w:p>
+            <w:pPr>
+              <w:pStyle w:val="Sinespaciado"/>
+              <w:contextualSpacing/>
+              <w:rPr>
+                <w:sz w:val="16"/>
+                <w:szCs w:val="16"/>
+              </w:rPr>
+            </w:pPr>
+            <w:r>
+              <w:rPr>
+                <w:sz w:val="16"/>
+                <w:szCs w:val="16"/>
+              </w:rPr>
+              <w:t>ups( b,a );</w:t>
+            </w:r>
+          </w:p>
+          <w:p>
+            <w:pPr>
+              <w:pStyle w:val="Sinespaciado"/>
+              <w:contextualSpacing/>
+              <w:rPr>
+                <w:sz w:val="16"/>
+                <w:szCs w:val="16"/>
+              </w:rPr>
+            </w:pPr>
+            <w:r>
+              <w:rPr>
+                <w:sz w:val="16"/>
+                <w:szCs w:val="16"/>
+              </w:rPr>
               <w:t>ups( b, a);</w:t>
             </w:r>
           </w:p>
@@ -6257,673 +6888,24 @@
                 <w:sz w:val="16"/>
                 <w:szCs w:val="16"/>
               </w:rPr>
-              <w:t>ups( y2, x1);</w:t>
-            </w:r>
-          </w:p>
-          <w:p>
-            <w:pPr>
-              <w:pStyle w:val="Sinespaciado"/>
-              <w:contextualSpacing/>
-              <w:rPr>
-                <w:sz w:val="16"/>
-                <w:szCs w:val="16"/>
-              </w:rPr>
-            </w:pPr>
-            <w:r>
-              <w:rPr>
-                <w:sz w:val="16"/>
-                <w:szCs w:val="16"/>
-              </w:rPr>
-              <w:t>ups( param2, param1);</w:t>
-            </w:r>
-          </w:p>
-          <w:p>
-            <w:pPr>
-              <w:pStyle w:val="Sinespaciado"/>
-              <w:contextualSpacing/>
-              <w:rPr>
-                <w:sz w:val="16"/>
-                <w:szCs w:val="16"/>
-              </w:rPr>
-            </w:pPr>
-          </w:p>
-          <w:p>
-            <w:pPr>
-              <w:pStyle w:val="Sinespaciado"/>
-              <w:contextualSpacing/>
-              <w:rPr>
-                <w:sz w:val="16"/>
-                <w:szCs w:val="16"/>
-              </w:rPr>
-            </w:pPr>
-            <w:r>
-              <w:rPr>
-                <w:sz w:val="16"/>
-                <w:szCs w:val="16"/>
-              </w:rPr>
-              <w:t>// Tres parámetros (NO intercambiar)</w:t>
-            </w:r>
-          </w:p>
-          <w:p>
-            <w:pPr>
-              <w:pStyle w:val="Sinespaciado"/>
-              <w:contextualSpacing/>
-              <w:rPr>
-                <w:sz w:val="16"/>
-                <w:szCs w:val="16"/>
-              </w:rPr>
-            </w:pPr>
-            <w:r>
-              <w:rPr>
-                <w:sz w:val="16"/>
-                <w:szCs w:val="16"/>
-              </w:rPr>
-              <w:t>ups(a,  b, c);</w:t>
-            </w:r>
-          </w:p>
-          <w:p>
-            <w:pPr>
-              <w:pStyle w:val="Sinespaciado"/>
-              <w:contextualSpacing/>
-              <w:rPr>
-                <w:sz w:val="16"/>
-                <w:szCs w:val="16"/>
-              </w:rPr>
-            </w:pPr>
-            <w:r>
-              <w:rPr>
-                <w:sz w:val="16"/>
-                <w:szCs w:val="16"/>
-              </w:rPr>
-              <w:t>ups(x,  y, z);</w:t>
-            </w:r>
-          </w:p>
-          <w:p>
-            <w:pPr>
-              <w:pStyle w:val="Sinespaciado"/>
-              <w:contextualSpacing/>
-              <w:rPr>
-                <w:sz w:val="16"/>
-                <w:szCs w:val="16"/>
-              </w:rPr>
-            </w:pPr>
-          </w:p>
-          <w:p>
-            <w:pPr>
-              <w:pStyle w:val="Sinespaciado"/>
-              <w:contextualSpacing/>
-              <w:rPr>
-                <w:sz w:val="16"/>
-                <w:szCs w:val="16"/>
-              </w:rPr>
-            </w:pPr>
-            <w:r>
-              <w:rPr>
-                <w:sz w:val="16"/>
-                <w:szCs w:val="16"/>
-              </w:rPr>
-              <w:t>// Cuatro o más parámetros (NO intercambiar)</w:t>
-            </w:r>
-          </w:p>
-          <w:p>
-            <w:pPr>
-              <w:pStyle w:val="Sinespaciado"/>
-              <w:contextualSpacing/>
-              <w:rPr>
-                <w:sz w:val="16"/>
-                <w:szCs w:val="16"/>
-              </w:rPr>
-            </w:pPr>
-            <w:r>
-              <w:rPr>
-                <w:sz w:val="16"/>
-                <w:szCs w:val="16"/>
-              </w:rPr>
-              <w:t>ups(a,  b, c, d);</w:t>
-            </w:r>
-          </w:p>
-          <w:p>
-            <w:pPr>
-              <w:pStyle w:val="Sinespaciado"/>
-              <w:contextualSpacing/>
-              <w:rPr>
-                <w:sz w:val="16"/>
-                <w:szCs w:val="16"/>
-              </w:rPr>
-            </w:pPr>
-            <w:r>
-              <w:rPr>
-                <w:sz w:val="16"/>
-                <w:szCs w:val="16"/>
-              </w:rPr>
-              <w:t>ups(p1,  p2, p3, p4, p5);</w:t>
-            </w:r>
-          </w:p>
-          <w:p>
-            <w:pPr>
-              <w:pStyle w:val="Sinespaciado"/>
-              <w:contextualSpacing/>
-              <w:rPr>
-                <w:sz w:val="16"/>
-                <w:szCs w:val="16"/>
-              </w:rPr>
-            </w:pPr>
-          </w:p>
-          <w:p>
-            <w:pPr>
-              <w:pStyle w:val="Sinespaciado"/>
-              <w:contextualSpacing/>
-              <w:rPr>
-                <w:sz w:val="16"/>
-                <w:szCs w:val="16"/>
-              </w:rPr>
-            </w:pPr>
-          </w:p>
-          <w:p>
-            <w:pPr>
-              <w:pStyle w:val="Sinespaciado"/>
-              <w:contextualSpacing/>
-              <w:rPr>
-                <w:sz w:val="16"/>
-                <w:szCs w:val="16"/>
-              </w:rPr>
-            </w:pPr>
-          </w:p>
-          <w:p>
-            <w:pPr>
-              <w:pStyle w:val="Sinespaciado"/>
-              <w:contextualSpacing/>
-              <w:rPr>
-                <w:sz w:val="16"/>
-                <w:szCs w:val="16"/>
-              </w:rPr>
-            </w:pPr>
-          </w:p>
-          <w:p>
-            <w:pPr>
-              <w:pStyle w:val="Sinespaciado"/>
-              <w:contextualSpacing/>
-              <w:rPr>
-                <w:sz w:val="16"/>
-                <w:szCs w:val="16"/>
-              </w:rPr>
-            </w:pPr>
-            <w:r>
-              <w:rPr>
-                <w:sz w:val="16"/>
-                <w:szCs w:val="16"/>
-              </w:rPr>
-              <w:t>/* ========================================</w:t>
-            </w:r>
-          </w:p>
-          <w:p>
-            <w:pPr>
-              <w:pStyle w:val="Sinespaciado"/>
-              <w:contextualSpacing/>
-              <w:rPr>
-                <w:sz w:val="16"/>
-                <w:szCs w:val="16"/>
-              </w:rPr>
-            </w:pPr>
-            <w:r>
-              <w:rPr>
-                <w:sz w:val="16"/>
-                <w:szCs w:val="16"/>
-              </w:rPr>
-              <w:t xml:space="preserve">   CASO 4: ups con espacios variados</w:t>
-            </w:r>
-          </w:p>
-          <w:p>
-            <w:pPr>
-              <w:pStyle w:val="Sinespaciado"/>
-              <w:contextualSpacing/>
-              <w:rPr>
-                <w:sz w:val="16"/>
-                <w:szCs w:val="16"/>
-              </w:rPr>
-            </w:pPr>
-            <w:r>
-              <w:rPr>
-                <w:sz w:val="16"/>
-                <w:szCs w:val="16"/>
-              </w:rPr>
-              <w:t xml:space="preserve">   ======================================== NO ACTUALIZADO*/</w:t>
-            </w:r>
-          </w:p>
-          <w:p>
-            <w:pPr>
-              <w:pStyle w:val="Sinespaciado"/>
-              <w:contextualSpacing/>
-              <w:rPr>
-                <w:sz w:val="16"/>
-                <w:szCs w:val="16"/>
-              </w:rPr>
-            </w:pPr>
-            <w:r>
-              <w:rPr>
-                <w:sz w:val="16"/>
-                <w:szCs w:val="16"/>
-              </w:rPr>
-              <w:t>ups ( b, a);</w:t>
-            </w:r>
-          </w:p>
-          <w:p>
-            <w:pPr>
-              <w:pStyle w:val="Sinespaciado"/>
-              <w:contextualSpacing/>
-              <w:rPr>
-                <w:sz w:val="16"/>
-                <w:szCs w:val="16"/>
-              </w:rPr>
-            </w:pPr>
-            <w:r>
-              <w:rPr>
-                <w:sz w:val="16"/>
-                <w:szCs w:val="16"/>
-              </w:rPr>
-              <w:t>ups  ( y, x);</w:t>
-            </w:r>
-          </w:p>
-          <w:p>
-            <w:pPr>
-              <w:pStyle w:val="Sinespaciado"/>
-              <w:contextualSpacing/>
-              <w:rPr>
-                <w:sz w:val="16"/>
-                <w:szCs w:val="16"/>
-              </w:rPr>
-            </w:pPr>
-            <w:r>
-              <w:rPr>
-                <w:sz w:val="16"/>
-                <w:szCs w:val="16"/>
-              </w:rPr>
-              <w:t>ups</w:t>
-            </w:r>
-            <w:r>
-              <w:rPr>
-                <w:sz w:val="16"/>
-                <w:szCs w:val="16"/>
-              </w:rPr>
-              <w:tab/>
-              <w:t>( n, m);</w:t>
-            </w:r>
-          </w:p>
-          <w:p>
-            <w:pPr>
-              <w:pStyle w:val="Sinespaciado"/>
-              <w:contextualSpacing/>
-              <w:rPr>
-                <w:sz w:val="16"/>
-                <w:szCs w:val="16"/>
-              </w:rPr>
-            </w:pPr>
-            <w:r>
-              <w:rPr>
-                <w:sz w:val="16"/>
-                <w:szCs w:val="16"/>
-              </w:rPr>
-              <w:t>ups      ( q, p);</w:t>
-            </w:r>
-          </w:p>
-          <w:p>
-            <w:pPr>
-              <w:pStyle w:val="Sinespaciado"/>
-              <w:contextualSpacing/>
-              <w:rPr>
-                <w:sz w:val="16"/>
-                <w:szCs w:val="16"/>
-              </w:rPr>
-            </w:pPr>
-            <w:r>
-              <w:rPr>
-                <w:sz w:val="16"/>
-                <w:szCs w:val="16"/>
-              </w:rPr>
-              <w:t>ups                                          ( t, s);</w:t>
-            </w:r>
-          </w:p>
-          <w:p>
-            <w:pPr>
-              <w:pStyle w:val="Sinespaciado"/>
-              <w:contextualSpacing/>
-              <w:rPr>
-                <w:sz w:val="16"/>
-                <w:szCs w:val="16"/>
-              </w:rPr>
-            </w:pPr>
-          </w:p>
-          <w:p>
-            <w:pPr>
-              <w:pStyle w:val="Sinespaciado"/>
-              <w:contextualSpacing/>
-              <w:rPr>
-                <w:sz w:val="16"/>
-                <w:szCs w:val="16"/>
-              </w:rPr>
-            </w:pPr>
-            <w:r>
-              <w:rPr>
-                <w:sz w:val="16"/>
-                <w:szCs w:val="16"/>
-              </w:rPr>
-              <w:t>/* ========================================</w:t>
-            </w:r>
-          </w:p>
-          <w:p>
-            <w:pPr>
-              <w:pStyle w:val="Sinespaciado"/>
-              <w:contextualSpacing/>
-              <w:rPr>
-                <w:sz w:val="16"/>
-                <w:szCs w:val="16"/>
-              </w:rPr>
-            </w:pPr>
-            <w:r>
-              <w:rPr>
-                <w:sz w:val="16"/>
-                <w:szCs w:val="16"/>
-              </w:rPr>
-              <w:t xml:space="preserve">   CASO 5: Parámetros con expresiones</w:t>
-            </w:r>
-          </w:p>
-          <w:p>
-            <w:pPr>
-              <w:pStyle w:val="Sinespaciado"/>
-              <w:contextualSpacing/>
-              <w:rPr>
-                <w:sz w:val="16"/>
-                <w:szCs w:val="16"/>
-              </w:rPr>
-            </w:pPr>
-            <w:r>
-              <w:rPr>
-                <w:sz w:val="16"/>
-                <w:szCs w:val="16"/>
-              </w:rPr>
-              <w:t xml:space="preserve">   ======================================== */</w:t>
-            </w:r>
-          </w:p>
-          <w:p>
-            <w:pPr>
-              <w:pStyle w:val="Sinespaciado"/>
-              <w:contextualSpacing/>
-              <w:rPr>
-                <w:sz w:val="16"/>
-                <w:szCs w:val="16"/>
-              </w:rPr>
-            </w:pPr>
-            <w:r>
-              <w:rPr>
-                <w:sz w:val="16"/>
-                <w:szCs w:val="16"/>
-              </w:rPr>
-              <w:t>ups( c-d, a+b);</w:t>
-            </w:r>
-          </w:p>
-          <w:p>
-            <w:pPr>
-              <w:pStyle w:val="Sinespaciado"/>
-              <w:contextualSpacing/>
-              <w:rPr>
-                <w:sz w:val="16"/>
-                <w:szCs w:val="16"/>
-              </w:rPr>
-            </w:pPr>
-            <w:r>
-              <w:rPr>
-                <w:sz w:val="16"/>
-                <w:szCs w:val="16"/>
-              </w:rPr>
-              <w:t>ups( y/3, x*2);</w:t>
-            </w:r>
-          </w:p>
-          <w:p>
-            <w:pPr>
-              <w:pStyle w:val="Sinespaciado"/>
-              <w:contextualSpacing/>
-              <w:rPr>
-                <w:sz w:val="16"/>
-                <w:szCs w:val="16"/>
-              </w:rPr>
-            </w:pPr>
-            <w:r>
-              <w:rPr>
-                <w:sz w:val="16"/>
-                <w:szCs w:val="16"/>
-              </w:rPr>
-              <w:t>ups( arr[1], arr[0]);</w:t>
-            </w:r>
-          </w:p>
-          <w:p>
-            <w:pPr>
-              <w:pStyle w:val="Sinespaciado"/>
-              <w:contextualSpacing/>
-              <w:rPr>
-                <w:sz w:val="16"/>
-                <w:szCs w:val="16"/>
-              </w:rPr>
-            </w:pPr>
-            <w:r>
-              <w:rPr>
-                <w:sz w:val="16"/>
-                <w:szCs w:val="16"/>
-              </w:rPr>
-              <w:t>ups(func(), var);</w:t>
-            </w:r>
-          </w:p>
-          <w:p>
-            <w:pPr>
-              <w:pStyle w:val="Sinespaciado"/>
-              <w:contextualSpacing/>
-              <w:rPr>
-                <w:sz w:val="16"/>
-                <w:szCs w:val="16"/>
-              </w:rPr>
-            </w:pPr>
-            <w:r>
-              <w:rPr>
-                <w:sz w:val="16"/>
-                <w:szCs w:val="16"/>
-              </w:rPr>
-              <w:t>ups( --b, a++);</w:t>
-            </w:r>
-          </w:p>
-          <w:p>
-            <w:pPr>
-              <w:pStyle w:val="Sinespaciado"/>
-              <w:contextualSpacing/>
-              <w:rPr>
-                <w:sz w:val="16"/>
-                <w:szCs w:val="16"/>
-              </w:rPr>
-            </w:pPr>
-            <w:r>
-              <w:rPr>
-                <w:sz w:val="16"/>
-                <w:szCs w:val="16"/>
-              </w:rPr>
-              <w:t>ups( y&lt;10, x&gt;0);</w:t>
-            </w:r>
-          </w:p>
-          <w:p>
-            <w:pPr>
-              <w:pStyle w:val="Sinespaciado"/>
-              <w:contextualSpacing/>
-              <w:rPr>
-                <w:sz w:val="16"/>
-                <w:szCs w:val="16"/>
-              </w:rPr>
-            </w:pPr>
-            <w:r>
-              <w:rPr>
-                <w:sz w:val="16"/>
-                <w:szCs w:val="16"/>
-              </w:rPr>
-              <w:t>ups(x&gt;0,  y&lt;10,a);</w:t>
-            </w:r>
-          </w:p>
-          <w:p>
-            <w:pPr>
-              <w:pStyle w:val="Sinespaciado"/>
-              <w:contextualSpacing/>
-              <w:rPr>
-                <w:sz w:val="16"/>
-                <w:szCs w:val="16"/>
-              </w:rPr>
-            </w:pPr>
-            <w:r>
-              <w:rPr>
-                <w:sz w:val="16"/>
-                <w:szCs w:val="16"/>
-              </w:rPr>
-              <w:t>ups( y&lt;10, x&gt;0;asdfaf);</w:t>
-            </w:r>
-          </w:p>
-          <w:p>
-            <w:pPr>
-              <w:pStyle w:val="Sinespaciado"/>
-              <w:contextualSpacing/>
-              <w:rPr>
-                <w:sz w:val="16"/>
-                <w:szCs w:val="16"/>
-              </w:rPr>
-            </w:pPr>
-          </w:p>
-          <w:p>
-            <w:pPr>
-              <w:pStyle w:val="Sinespaciado"/>
-              <w:contextualSpacing/>
-              <w:rPr>
-                <w:sz w:val="16"/>
-                <w:szCs w:val="16"/>
-              </w:rPr>
-            </w:pPr>
-            <w:r>
-              <w:rPr>
-                <w:sz w:val="16"/>
-                <w:szCs w:val="16"/>
-              </w:rPr>
-              <w:t>/* ========================================</w:t>
-            </w:r>
-          </w:p>
-          <w:p>
-            <w:pPr>
-              <w:pStyle w:val="Sinespaciado"/>
-              <w:contextualSpacing/>
-              <w:rPr>
-                <w:sz w:val="16"/>
-                <w:szCs w:val="16"/>
-              </w:rPr>
-            </w:pPr>
-            <w:r>
-              <w:rPr>
-                <w:sz w:val="16"/>
-                <w:szCs w:val="16"/>
-              </w:rPr>
-              <w:t xml:space="preserve">   CASO 6: Parámetros con espacios y saltos</w:t>
-            </w:r>
-          </w:p>
-          <w:p>
-            <w:pPr>
-              <w:pStyle w:val="Sinespaciado"/>
-              <w:contextualSpacing/>
-              <w:rPr>
-                <w:sz w:val="16"/>
-                <w:szCs w:val="16"/>
-              </w:rPr>
-            </w:pPr>
-            <w:r>
-              <w:rPr>
-                <w:sz w:val="16"/>
-                <w:szCs w:val="16"/>
-              </w:rPr>
-              <w:t xml:space="preserve">   ======================================== */</w:t>
-            </w:r>
-          </w:p>
-          <w:p>
-            <w:pPr>
-              <w:pStyle w:val="Sinespaciado"/>
-              <w:contextualSpacing/>
-              <w:rPr>
-                <w:sz w:val="16"/>
-                <w:szCs w:val="16"/>
-              </w:rPr>
-            </w:pPr>
-            <w:r>
-              <w:rPr>
-                <w:sz w:val="16"/>
-                <w:szCs w:val="16"/>
-              </w:rPr>
-              <w:t>ups(b, a );</w:t>
-            </w:r>
-          </w:p>
-          <w:p>
-            <w:pPr>
-              <w:pStyle w:val="Sinespaciado"/>
-              <w:contextualSpacing/>
-              <w:rPr>
-                <w:sz w:val="16"/>
-                <w:szCs w:val="16"/>
-              </w:rPr>
-            </w:pPr>
-            <w:r>
-              <w:rPr>
-                <w:sz w:val="16"/>
-                <w:szCs w:val="16"/>
-              </w:rPr>
-              <w:t>ups( b, a );</w:t>
-            </w:r>
-          </w:p>
-          <w:p>
-            <w:pPr>
-              <w:pStyle w:val="Sinespaciado"/>
-              <w:contextualSpacing/>
-              <w:rPr>
-                <w:sz w:val="16"/>
-                <w:szCs w:val="16"/>
-              </w:rPr>
-            </w:pPr>
-            <w:r>
-              <w:rPr>
-                <w:sz w:val="16"/>
-                <w:szCs w:val="16"/>
-              </w:rPr>
-              <w:t>ups( b,  a);</w:t>
-            </w:r>
-          </w:p>
-          <w:p>
-            <w:pPr>
-              <w:pStyle w:val="Sinespaciado"/>
-              <w:contextualSpacing/>
-              <w:rPr>
-                <w:sz w:val="16"/>
-                <w:szCs w:val="16"/>
-              </w:rPr>
-            </w:pPr>
-            <w:r>
-              <w:rPr>
-                <w:sz w:val="16"/>
-                <w:szCs w:val="16"/>
-              </w:rPr>
-              <w:t>ups( b , a);</w:t>
-            </w:r>
-          </w:p>
-          <w:p>
-            <w:pPr>
-              <w:pStyle w:val="Sinespaciado"/>
-              <w:contextualSpacing/>
-              <w:rPr>
-                <w:sz w:val="16"/>
-                <w:szCs w:val="16"/>
-              </w:rPr>
-            </w:pPr>
-            <w:r>
-              <w:rPr>
-                <w:sz w:val="16"/>
-                <w:szCs w:val="16"/>
-              </w:rPr>
-              <w:t>ups( b ,  a );</w:t>
+              <w:t>ups( b ,a);</w:t>
+            </w:r>
+          </w:p>
+          <w:p>
+            <w:pPr>
+              <w:pStyle w:val="Sinespaciado"/>
+              <w:contextualSpacing/>
+              <w:rPr>
+                <w:sz w:val="16"/>
+                <w:szCs w:val="16"/>
+              </w:rPr>
+            </w:pPr>
+            <w:r>
+              <w:rPr>
+                <w:sz w:val="16"/>
+                <w:szCs w:val="16"/>
+              </w:rPr>
+              <w:t>ups( b , a );</w:t>
             </w:r>
           </w:p>
           <w:p>
@@ -6974,7 +6956,7 @@
                 <w:sz w:val="16"/>
                 <w:szCs w:val="16"/>
               </w:rPr>
-              <w:t xml:space="preserve">, </w:t>
+              <w:t>,</w:t>
             </w:r>
           </w:p>
           <w:p>
@@ -7042,7 +7024,7 @@
                 <w:sz w:val="16"/>
                 <w:szCs w:val="16"/>
               </w:rPr>
-              <w:t xml:space="preserve">, </w:t>
+              <w:t>,</w:t>
             </w:r>
           </w:p>
           <w:p>
@@ -8254,7 +8236,7 @@
                 <w:sz w:val="16"/>
                 <w:szCs w:val="16"/>
               </w:rPr>
-              <w:t>/* comentario */ ups( b, a); /* otro comentario con ups NO ACTUALIZADO*/</w:t>
+              <w:t>/* comentario */ ups( b,a); /* otro comentario con ups NO ACTUALIZADO*/</w:t>
             </w:r>
           </w:p>
           <w:p>
@@ -8298,7 +8280,7 @@
                 <w:sz w:val="16"/>
                 <w:szCs w:val="16"/>
               </w:rPr>
-              <w:t>ups( y, x); // ups al finalNO ACTUALIZADO</w:t>
+              <w:t>ups( y,x); // ups al finalNO ACTUALIZADO</w:t>
             </w:r>
           </w:p>
           <w:p>
@@ -8584,7 +8566,7 @@
                 <w:sz w:val="16"/>
                 <w:szCs w:val="16"/>
               </w:rPr>
-              <w:t>ups( b, a); ups( d, c); ups( f, e);</w:t>
+              <w:t>ups( b,a); ups( d,c); ups( f,e);</w:t>
             </w:r>
           </w:p>
           <w:p>
@@ -8628,24 +8610,24 @@
                 <w:sz w:val="16"/>
                 <w:szCs w:val="16"/>
               </w:rPr>
-              <w:t>if (ups( b, a) &gt; 0 &amp;&amp; ups( d, c) &lt; 10) {</w:t>
-            </w:r>
-          </w:p>
-          <w:p>
-            <w:pPr>
-              <w:pStyle w:val="Sinespaciado"/>
-              <w:contextualSpacing/>
-              <w:rPr>
-                <w:sz w:val="16"/>
-                <w:szCs w:val="16"/>
-              </w:rPr>
-            </w:pPr>
-            <w:r>
-              <w:rPr>
-                <w:sz w:val="16"/>
-                <w:szCs w:val="16"/>
-              </w:rPr>
-              <w:t xml:space="preserve">    x = ups( f, e);</w:t>
+              <w:t>if (ups( b,a) &gt; 0 &amp;&amp; ups( d,c) &lt; 10) {</w:t>
+            </w:r>
+          </w:p>
+          <w:p>
+            <w:pPr>
+              <w:pStyle w:val="Sinespaciado"/>
+              <w:contextualSpacing/>
+              <w:rPr>
+                <w:sz w:val="16"/>
+                <w:szCs w:val="16"/>
+              </w:rPr>
+            </w:pPr>
+            <w:r>
+              <w:rPr>
+                <w:sz w:val="16"/>
+                <w:szCs w:val="16"/>
+              </w:rPr>
+              <w:t xml:space="preserve">    x = ups( f,e);</w:t>
             </w:r>
           </w:p>
           <w:p>
@@ -8706,24 +8688,24 @@
                 <w:sz w:val="16"/>
                 <w:szCs w:val="16"/>
               </w:rPr>
-              <w:t>while (ups( j, i)) {</w:t>
-            </w:r>
-          </w:p>
-          <w:p>
-            <w:pPr>
-              <w:pStyle w:val="Sinespaciado"/>
-              <w:contextualSpacing/>
-              <w:rPr>
-                <w:sz w:val="16"/>
-                <w:szCs w:val="16"/>
-              </w:rPr>
-            </w:pPr>
-            <w:r>
-              <w:rPr>
-                <w:sz w:val="16"/>
-                <w:szCs w:val="16"/>
-              </w:rPr>
-              <w:t xml:space="preserve">    ups( l, k);</w:t>
+              <w:t>while (ups( j,i)) {</w:t>
+            </w:r>
+          </w:p>
+          <w:p>
+            <w:pPr>
+              <w:pStyle w:val="Sinespaciado"/>
+              <w:contextualSpacing/>
+              <w:rPr>
+                <w:sz w:val="16"/>
+                <w:szCs w:val="16"/>
+              </w:rPr>
+            </w:pPr>
+            <w:r>
+              <w:rPr>
+                <w:sz w:val="16"/>
+                <w:szCs w:val="16"/>
+              </w:rPr>
+              <w:t xml:space="preserve">    ups( l,k);</w:t>
             </w:r>
           </w:p>
           <w:p>
@@ -8818,7 +8800,7 @@
                 <w:sz w:val="16"/>
                 <w:szCs w:val="16"/>
               </w:rPr>
-              <w:t>ups( ,  );</w:t>
+              <w:t>ups( , );</w:t>
             </w:r>
           </w:p>
           <w:p>
@@ -8852,7 +8834,7 @@
                 <w:sz w:val="16"/>
                 <w:szCs w:val="16"/>
               </w:rPr>
-              <w:t>ups(, a);</w:t>
+              <w:t>ups(,a);</w:t>
             </w:r>
           </w:p>
           <w:p>
@@ -9086,7 +9068,7 @@
                 <w:sz w:val="16"/>
                 <w:szCs w:val="16"/>
               </w:rPr>
-              <w:t>ups( real2, real1);</w:t>
+              <w:t>ups( real2,real1);</w:t>
             </w:r>
           </w:p>
           <w:p>
@@ -9293,41 +9275,41 @@
                 <w:sz w:val="16"/>
                 <w:szCs w:val="16"/>
               </w:rPr>
-              <w:t>ups(alpha, beta); /* también upsNO ACTUALIZADO */</w:t>
-            </w:r>
-          </w:p>
-          <w:p>
-            <w:pPr>
-              <w:pStyle w:val="Sinespaciado"/>
-              <w:contextualSpacing/>
-              <w:rPr>
-                <w:sz w:val="16"/>
-                <w:szCs w:val="16"/>
-              </w:rPr>
-            </w:pPr>
-            <w:r>
-              <w:rPr>
-                <w:sz w:val="16"/>
-                <w:szCs w:val="16"/>
-              </w:rPr>
-              <w:t>if (ups(gamma, delta)) { // otra vez upsNO ACTUALIZADO</w:t>
-            </w:r>
-          </w:p>
-          <w:p>
-            <w:pPr>
-              <w:pStyle w:val="Sinespaciado"/>
-              <w:contextualSpacing/>
-              <w:rPr>
-                <w:sz w:val="16"/>
-                <w:szCs w:val="16"/>
-              </w:rPr>
-            </w:pPr>
-            <w:r>
-              <w:rPr>
-                <w:sz w:val="16"/>
-                <w:szCs w:val="16"/>
-              </w:rPr>
-              <w:t xml:space="preserve">    ups(epsilon, zeta);</w:t>
+              <w:t>ups(alpha,beta); /* también upsNO ACTUALIZADO */</w:t>
+            </w:r>
+          </w:p>
+          <w:p>
+            <w:pPr>
+              <w:pStyle w:val="Sinespaciado"/>
+              <w:contextualSpacing/>
+              <w:rPr>
+                <w:sz w:val="16"/>
+                <w:szCs w:val="16"/>
+              </w:rPr>
+            </w:pPr>
+            <w:r>
+              <w:rPr>
+                <w:sz w:val="16"/>
+                <w:szCs w:val="16"/>
+              </w:rPr>
+              <w:t>if (ups(gamma,delta)) { // otra vez upsNO ACTUALIZADO</w:t>
+            </w:r>
+          </w:p>
+          <w:p>
+            <w:pPr>
+              <w:pStyle w:val="Sinespaciado"/>
+              <w:contextualSpacing/>
+              <w:rPr>
+                <w:sz w:val="16"/>
+                <w:szCs w:val="16"/>
+              </w:rPr>
+            </w:pPr>
+            <w:r>
+              <w:rPr>
+                <w:sz w:val="16"/>
+                <w:szCs w:val="16"/>
+              </w:rPr>
+              <w:t xml:space="preserve">    ups(epsilon,zeta);</w:t>
             </w:r>
           </w:p>
           <w:p>
@@ -9439,7 +9421,7 @@
                 <w:sz w:val="16"/>
                 <w:szCs w:val="16"/>
               </w:rPr>
-              <w:t>ups(variable_con_nombre_muy_largo_1, variable_con_nombre_muy_largo_2);</w:t>
+              <w:t>ups(variable_con_nombre_muy_largo_1,variable_con_nombre_muy_largo_2);</w:t>
             </w:r>
           </w:p>
           <w:p>
@@ -9490,7 +9472,7 @@
                 <w:sz w:val="16"/>
                 <w:szCs w:val="16"/>
               </w:rPr>
-              <w:t xml:space="preserve">, </w:t>
+              <w:t>,</w:t>
             </w:r>
           </w:p>
           <w:p>

</xml_diff>